<commit_message>
fix(findings,strategy,reviewer): R6 as reputation strength, verify_entities allowlist & docs verification tests
</commit_message>
<xml_diff>
--- a/runs/demo/propuesta_cliente.docx
+++ b/runs/demo/propuesta_cliente.docx
@@ -18,9 +18,9 @@
         <w:rPr>
           <w:i/>
         </w:rPr>
-        <w:t>Modo: Cliente · Run ID: demo · Fecha: 2026-10-20 22:15</w:t>
+        <w:t>Modo: Cliente · Run ID: demo · Fecha: 2026-10-20 22:41</w:t>
         <w:br/>
-        <w:t>Sello Revisor: 563/563 cifras trazables · 0 incidencias normativas</w:t>
+        <w:t>Sello Revisor: 571/571 cifras trazables · 0 incidencias normativas</w:t>
         <w:br/>
         <w:t>Aviso: Estudio elaborado sobre datos sintéticos del kit UFV-EPS × reload.</w:t>
       </w:r>
@@ -4642,7 +4642,7 @@
         <w:pStyle w:val="Heading2"/>
       </w:pPr>
       <w:r>
-        <w:t>H7 · Reputación asistida sólida y oportunidad en seguimiento postoperatorio</w:t>
+        <w:t>H7 · Fortaleza en reputación asistida: reputación sólida cuando la nombran; el problema es la visibilidad espontánea</w:t>
       </w:r>
     </w:p>
     <w:p>
@@ -4658,7 +4658,7 @@
         <w:pStyle w:val="ListBullet"/>
       </w:pPr>
       <w:r>
-        <w:t>Descripción: En menciones asistidas, Clínica Alborada Visión presenta solo un 9.3% de menciones negativas y fuerza media de 1.21 (n=108), mientras que Láser Nítida acumula un 34.3% de menciones negativas por seguimiento postoperatorio (n=108).</w:t>
+        <w:t>Descripción: FORTALEZA: cuando se consulta por la marca en asistido, Clínica Alborada Visión presenta una reputación sólida con solo un 9.3% de menciones negativas y fuerza media de 1.21 (n=108), frente al 25.9% de Vistalia Oftalmología (n=108) y el 34.3% de Láser Nítida por seguimiento postoperatorio (n=108). Esto contrasta la hipótesis del cliente «con tan buenas reseñas deberíamos salir recomendados»: la reputación es sólida cuando la nombran, pero el problema es la visibilidad espontánea (38.8%, n=240).</w:t>
       </w:r>
     </w:p>
     <w:p>
@@ -4666,7 +4666,7 @@
         <w:pStyle w:val="ListBullet"/>
       </w:pPr>
       <w:r>
-        <w:t>Evidencia trazable: pct_negativo_asistida[marca=Clínica Alborada Visión] = 9.3 (T9, n=108, ej: EJ-0067, EJ-0079, EJ-0110); fuerza_media_asistida[marca=Clínica Alborada Visión] = 1.21 (T9, n=108, ej: EJ-0067, EJ-0079, EJ-0110); pct_negativo_asistida[marca=Láser Nítida] = 34.3 (T9, n=108, ej: EJ-0048, EJ-0058, EJ-0060)</w:t>
+        <w:t>Evidencia trazable: pct_negativo_asistida[marca=Clínica Alborada Visión] = 9.3 (T9, n=108, ej: EJ-0067, EJ-0079, EJ-0110); fuerza_media_asistida[marca=Clínica Alborada Visión] = 1.21 (T9, n=108, ej: EJ-0067, EJ-0079, EJ-0110); pct_negativo_asistida[marca=Vistalia Oftalmología] = 25.9 (T9, n=108, ej: EJ-0049, EJ-0074, EJ-0085); pct_negativo_asistida[marca=Láser Nítida] = 34.3 (T9, n=108, ej: EJ-0048, EJ-0058, EJ-0060); tasa_aparicion_espontanea[marca=Clínica Alborada Visión] = 38.8 (T1_espontanea, n=240, ej: EJ-0002, EJ-0003, EJ-0006)</w:t>
       </w:r>
     </w:p>
     <w:p>
@@ -5898,7 +5898,7 @@
           </w:tcPr>
           <w:p>
             <w:r>
-              <w:t>1</w:t>
+              <w:t>0</w:t>
             </w:r>
           </w:p>
         </w:tc>
@@ -5908,7 +5908,7 @@
           </w:tcPr>
           <w:p>
             <w:r>
-              <w:t>Programa de activación y respuesta de reseñas verificadas en la sede de Barcelona</w:t>
+              <w:t>Fichas individuales de los 14 oftalmólogos con colegiación, publicaciones y subespecialidad</w:t>
             </w:r>
           </w:p>
         </w:tc>
@@ -5918,7 +5918,7 @@
           </w:tcPr>
           <w:p>
             <w:r>
-              <w:t>H1, H7</w:t>
+              <w:t>H6, H2</w:t>
             </w:r>
           </w:p>
         </w:tc>
@@ -5928,7 +5928,7 @@
           </w:tcPr>
           <w:p>
             <w:r>
-              <w:t>reputacion_resenas</w:t>
+              <w:t>entidad_datos_estructurados</w:t>
             </w:r>
           </w:p>
         </w:tc>
@@ -5938,7 +5938,7 @@
           </w:tcPr>
           <w:p>
             <w:r>
-              <w:t>cliente_comunicacion</w:t>
+              <w:t>cliente_marketing</w:t>
             </w:r>
           </w:p>
         </w:tc>
@@ -5958,7 +5958,7 @@
           </w:tcPr>
           <w:p>
             <w:r>
-              <w:t>L</w:t>
+              <w:t>M</w:t>
             </w:r>
           </w:p>
         </w:tc>
@@ -5968,7 +5968,7 @@
           </w:tcPr>
           <w:p>
             <w:r>
-              <w:t>S6–S10 (5 sem.)</w:t>
+              <w:t>S3–S5 (3 sem.)</w:t>
             </w:r>
           </w:p>
         </w:tc>
@@ -5988,7 +5988,7 @@
           </w:tcPr>
           <w:p>
             <w:r>
-              <w:t>&gt;= 100 nuevas reseñas verificadas en la sede de Barcelona con tasa de respuesta del 100 %</w:t>
+              <w:t>14 perfiles médicos completos con marcado Physician y autoría clínica visible</w:t>
             </w:r>
           </w:p>
         </w:tc>
@@ -6478,7 +6478,7 @@
           </w:tcPr>
           <w:p>
             <w:r>
-              <w:t>H6, H3, H4</w:t>
+              <w:t>H6, H3, H4, H7</w:t>
             </w:r>
           </w:p>
         </w:tc>
@@ -7000,7 +7000,7 @@
           </w:tcPr>
           <w:p>
             <w:r>
-              <w:t>A1, A2, A3, A4, A5</w:t>
+              <w:t>A1, A2, A3, A4, A5, A7</w:t>
             </w:r>
           </w:p>
         </w:tc>
@@ -7010,7 +7010,7 @@
           </w:tcPr>
           <w:p>
             <w:r>
-              <w:t>5,400 €</w:t>
+              <w:t>6,300 €</w:t>
             </w:r>
           </w:p>
         </w:tc>
@@ -7052,7 +7052,7 @@
           </w:tcPr>
           <w:p>
             <w:r>
-              <w:t>A6, A7, A8, A9, A10</w:t>
+              <w:t>A6, A8, A9, A10</w:t>
             </w:r>
           </w:p>
         </w:tc>
@@ -7062,7 +7062,7 @@
           </w:tcPr>
           <w:p>
             <w:r>
-              <w:t>7,900 €</w:t>
+              <w:t>7,000 €</w:t>
             </w:r>
           </w:p>
         </w:tc>
@@ -7316,7 +7316,7 @@
           </w:tcPr>
           <w:p>
             <w:r>
-              <w:t>2</w:t>
+              <w:t>3</w:t>
             </w:r>
           </w:p>
         </w:tc>
@@ -7326,7 +7326,7 @@
           </w:tcPr>
           <w:p>
             <w:r>
-              <w:t>2,150 €</w:t>
+              <w:t>3,050 €</w:t>
             </w:r>
           </w:p>
         </w:tc>
@@ -7336,7 +7336,7 @@
           </w:tcPr>
           <w:p>
             <w:r>
-              <w:t>8.8 %</w:t>
+              <w:t>12.6 %</w:t>
             </w:r>
           </w:p>
         </w:tc>
@@ -7358,7 +7358,7 @@
           </w:tcPr>
           <w:p>
             <w:r>
-              <w:t>3</w:t>
+              <w:t>2</w:t>
             </w:r>
           </w:p>
         </w:tc>
@@ -7368,7 +7368,7 @@
           </w:tcPr>
           <w:p>
             <w:r>
-              <w:t>3,850 €</w:t>
+              <w:t>2,950 €</w:t>
             </w:r>
           </w:p>
         </w:tc>
@@ -7378,7 +7378,7 @@
           </w:tcPr>
           <w:p>
             <w:r>
-              <w:t>15.8 %</w:t>
+              <w:t>12.1 %</w:t>
             </w:r>
           </w:p>
         </w:tc>
@@ -8972,6 +8972,68 @@
           </w:tcPr>
           <w:p>
             <w:r>
+              <w:t>pct_negativo_asistida[marca=Vistalia Oftalmología]</w:t>
+            </w:r>
+          </w:p>
+        </w:tc>
+        <w:tc>
+          <w:tcPr>
+            <w:tcW w:type="dxa" w:w="1440"/>
+          </w:tcPr>
+          <w:p>
+            <w:r>
+              <w:t>25.9</w:t>
+            </w:r>
+          </w:p>
+        </w:tc>
+        <w:tc>
+          <w:tcPr>
+            <w:tcW w:type="dxa" w:w="1440"/>
+          </w:tcPr>
+          <w:p>
+            <w:r>
+              <w:t>108</w:t>
+            </w:r>
+          </w:p>
+        </w:tc>
+        <w:tc>
+          <w:tcPr>
+            <w:tcW w:type="dxa" w:w="1440"/>
+          </w:tcPr>
+          <w:p>
+            <w:r>
+              <w:t>T9</w:t>
+            </w:r>
+          </w:p>
+        </w:tc>
+        <w:tc>
+          <w:tcPr>
+            <w:tcW w:type="dxa" w:w="1440"/>
+          </w:tcPr>
+          <w:p>
+            <w:r>
+              <w:t>EJ-0049, EJ-0074, EJ-0085</w:t>
+            </w:r>
+          </w:p>
+        </w:tc>
+      </w:tr>
+      <w:tr>
+        <w:tc>
+          <w:tcPr>
+            <w:tcW w:type="dxa" w:w="1440"/>
+          </w:tcPr>
+          <w:p>
+            <w:r>
+              <w:t>H7 (reputacion)</w:t>
+            </w:r>
+          </w:p>
+        </w:tc>
+        <w:tc>
+          <w:tcPr>
+            <w:tcW w:type="dxa" w:w="1440"/>
+          </w:tcPr>
+          <w:p>
+            <w:r>
               <w:t>pct_negativo_asistida[marca=Láser Nítida]</w:t>
             </w:r>
           </w:p>
@@ -9013,6 +9075,68 @@
           <w:p>
             <w:r>
               <w:t>EJ-0048, EJ-0058, EJ-0060</w:t>
+            </w:r>
+          </w:p>
+        </w:tc>
+      </w:tr>
+      <w:tr>
+        <w:tc>
+          <w:tcPr>
+            <w:tcW w:type="dxa" w:w="1440"/>
+          </w:tcPr>
+          <w:p>
+            <w:r>
+              <w:t>H7 (reputacion)</w:t>
+            </w:r>
+          </w:p>
+        </w:tc>
+        <w:tc>
+          <w:tcPr>
+            <w:tcW w:type="dxa" w:w="1440"/>
+          </w:tcPr>
+          <w:p>
+            <w:r>
+              <w:t>tasa_aparicion_espontanea[marca=Clínica Alborada Visión]</w:t>
+            </w:r>
+          </w:p>
+        </w:tc>
+        <w:tc>
+          <w:tcPr>
+            <w:tcW w:type="dxa" w:w="1440"/>
+          </w:tcPr>
+          <w:p>
+            <w:r>
+              <w:t>38.8</w:t>
+            </w:r>
+          </w:p>
+        </w:tc>
+        <w:tc>
+          <w:tcPr>
+            <w:tcW w:type="dxa" w:w="1440"/>
+          </w:tcPr>
+          <w:p>
+            <w:r>
+              <w:t>240</w:t>
+            </w:r>
+          </w:p>
+        </w:tc>
+        <w:tc>
+          <w:tcPr>
+            <w:tcW w:type="dxa" w:w="1440"/>
+          </w:tcPr>
+          <w:p>
+            <w:r>
+              <w:t>T1_espontanea</w:t>
+            </w:r>
+          </w:p>
+        </w:tc>
+        <w:tc>
+          <w:tcPr>
+            <w:tcW w:type="dxa" w:w="1440"/>
+          </w:tcPr>
+          <w:p>
+            <w:r>
+              <w:t>EJ-0002, EJ-0003, EJ-0006</w:t>
             </w:r>
           </w:p>
         </w:tc>
@@ -9041,7 +9165,7 @@
         <w:color w:val="646464"/>
         <w:sz w:val="17"/>
       </w:rPr>
-      <w:t>Datos sintéticos · demo · 2026-10-20 22:15</w:t>
+      <w:t>Datos sintéticos · demo · 2026-10-20 22:41</w:t>
     </w:r>
   </w:p>
 </w:ftr>

</xml_diff>

<commit_message>
fix(config,reviewer,findings,writer): catalog domains by Tipo_de_fuente, slug verify_entities on plan, R6 priority 2 & exact cost breakdown
</commit_message>
<xml_diff>
--- a/runs/demo/propuesta_cliente.docx
+++ b/runs/demo/propuesta_cliente.docx
@@ -18,9 +18,9 @@
         <w:rPr>
           <w:i/>
         </w:rPr>
-        <w:t>Modo: Cliente · Run ID: demo · Fecha: 2026-10-20 22:41</w:t>
+        <w:t>Modo: Cliente · Run ID: demo · Fecha: 2026-10-20 23:00</w:t>
         <w:br/>
-        <w:t>Sello Revisor: 571/571 cifras trazables · 0 incidencias normativas</w:t>
+        <w:t>Sello Revisor: 578/578 cifras trazables · 0 incidencias normativas</w:t>
         <w:br/>
         <w:t>Aviso: Estudio elaborado sobre datos sintéticos del kit UFV-EPS × reload.</w:t>
       </w:r>
@@ -136,7 +136,7 @@
     </w:p>
     <w:p>
       <w:r>
-        <w:t>Clínica Alborada Visión cuenta con una base asistencial y reputacional muy sólida (valoración de 4,7 sobre 5 con 1.800 opiniones, 14 oftalmólogos y 7.500 intervenciones al año), pero esa fortaleza aún no se traduce en visibilidad espontánea cuando un paciente consulta a un asistente de IA sin mencionar marcas. En las 240 ejecuciones espontáneas del estudio, Clínica Alborada Visión ocupa el puesto 7 de 10 con un Score de Citación de 27.97 puntos, un 38.8 % de aparición y un 6.7 % de recomendación activa, lejos del líder real del mercado (Grupo Hospitalario Valdecruz, con 90.8 % de aparición y score 75.02).</w:t>
+        <w:t>Clínica Alborada Visión cuenta con una base asistencial y reputacional muy sólida (valoración de 4,7 sobre 5 con 1.800 opiniones, 14 oftalmólogos y 7.500 intervenciones al año). En respuesta a la hipótesis del cliente («con tan buenas reseñas deberíamos salir recomendados»), los datos asistidos confirman esa fortaleza reputacional: cuando se nombra a la clínica (n=108), presenta una reputación sólida con solo un 9.3 % de menciones negativas y fuerza media de 1.21, frente al 25,9 % de Vistalia Oftalmología (n=108) y el 34,3 % de Láser Nítida (n=108); el problema no es la reputación cuando la nombran, sino la visibilidad espontánea. En las 240 ejecuciones espontáneas del estudio, Clínica Alborada Visión ocupa el puesto 7 de 10 con un Score de Citación de 27.97 puntos, un 38.8 % de aparición y un 6.7 % de recomendación activa, lejos del líder real del mercado (Grupo Hospitalario Valdecruz, con 90.8 % de aparición y score 75.02).</w:t>
       </w:r>
     </w:p>
     <w:p>
@@ -4482,7 +4482,7 @@
         <w:pStyle w:val="Heading2"/>
       </w:pPr>
       <w:r>
-        <w:t>H2 · Visibilidad espontánea deficitaria en ChatGPT, Claude</w:t>
+        <w:t>H2 · Fortaleza en reputación asistida: reputación sólida cuando la nombran; el problema es la visibilidad espontánea</w:t>
       </w:r>
     </w:p>
     <w:p>
@@ -4490,7 +4490,39 @@
         <w:pStyle w:val="ListBullet"/>
       </w:pPr>
       <w:r>
-        <w:t>Prioridad: 2 · Tipo: motor · Impacto: alto · Confianza: alta</w:t>
+        <w:t>Prioridad: 2 · Tipo: reputacion · Impacto: alto · Confianza: alta</w:t>
+      </w:r>
+    </w:p>
+    <w:p>
+      <w:pPr>
+        <w:pStyle w:val="ListBullet"/>
+      </w:pPr>
+      <w:r>
+        <w:t>Descripción: FORTALEZA: cuando se consulta por la marca en asistido, Clínica Alborada Visión presenta una reputación sólida con solo un 9.3% de menciones negativas y fuerza media de 1.21 (n=108), frente al 25.9% de Vistalia Oftalmología (n=108) y el 34.3% de Láser Nítida por seguimiento postoperatorio (n=108). Esto contrasta la hipótesis del cliente «con tan buenas reseñas deberíamos salir recomendados»: la reputación es sólida cuando la nombran, pero el problema es la visibilidad espontánea (38.8%, n=240).</w:t>
+      </w:r>
+    </w:p>
+    <w:p>
+      <w:pPr>
+        <w:pStyle w:val="ListBullet"/>
+      </w:pPr>
+      <w:r>
+        <w:t>Evidencia trazable: pct_negativo_asistida[marca=Clínica Alborada Visión] = 9.3 (T9, n=108, ej: EJ-0067, EJ-0079, EJ-0110); fuerza_media_asistida[marca=Clínica Alborada Visión] = 1.21 (T9, n=108, ej: EJ-0067, EJ-0079, EJ-0110); pct_negativo_asistida[marca=Vistalia Oftalmología] = 25.9 (T9, n=108, ej: EJ-0049, EJ-0074, EJ-0085); pct_negativo_asistida[marca=Láser Nítida] = 34.3 (T9, n=108, ej: EJ-0048, EJ-0058, EJ-0060); tasa_aparicion_espontanea[marca=Clínica Alborada Visión] = 38.8 (T1_espontanea, n=240, ej: EJ-0002, EJ-0003, EJ-0006)</w:t>
+      </w:r>
+    </w:p>
+    <w:p>
+      <w:pPr>
+        <w:pStyle w:val="Heading2"/>
+      </w:pPr>
+      <w:r>
+        <w:t>H3 · Visibilidad espontánea deficitaria en ChatGPT, Claude</w:t>
+      </w:r>
+    </w:p>
+    <w:p>
+      <w:pPr>
+        <w:pStyle w:val="ListBullet"/>
+      </w:pPr>
+      <w:r>
+        <w:t>Prioridad: 3 · Tipo: motor · Impacto: alto · Confianza: alta</w:t>
       </w:r>
     </w:p>
     <w:p>
@@ -4514,7 +4546,7 @@
         <w:pStyle w:val="Heading2"/>
       </w:pPr>
       <w:r>
-        <w:t>H3 · Brecha de visibilidad espontánea frente a Grupo Hospitalario Valdecruz y competidores directos</w:t>
+        <w:t>H4 · Brecha de visibilidad espontánea frente a Grupo Hospitalario Valdecruz y competidores directos</w:t>
       </w:r>
     </w:p>
     <w:p>
@@ -4522,7 +4554,7 @@
         <w:pStyle w:val="ListBullet"/>
       </w:pPr>
       <w:r>
-        <w:t>Prioridad: 3 · Tipo: competencia · Impacto: alto · Confianza: alta</w:t>
+        <w:t>Prioridad: 4 · Tipo: competencia · Impacto: alto · Confianza: alta</w:t>
       </w:r>
     </w:p>
     <w:p>
@@ -4546,7 +4578,7 @@
         <w:pStyle w:val="Heading2"/>
       </w:pPr>
       <w:r>
-        <w:t>H4 · Contraste Brief vs Datos: Vistalia omitida, Valdecruz líder real y reseñas insuficientes</w:t>
+        <w:t>H5 · Contraste Brief vs Datos: Vistalia omitida, Valdecruz líder real y reseñas insuficientes</w:t>
       </w:r>
     </w:p>
     <w:p>
@@ -4554,7 +4586,7 @@
         <w:pStyle w:val="ListBullet"/>
       </w:pPr>
       <w:r>
-        <w:t>Prioridad: 4 · Tipo: brief_vs_datos · Impacto: alto · Confianza: alta</w:t>
+        <w:t>Prioridad: 5 · Tipo: brief_vs_datos · Impacto: alto · Confianza: alta</w:t>
       </w:r>
     </w:p>
     <w:p>
@@ -4578,7 +4610,7 @@
         <w:pStyle w:val="Heading2"/>
       </w:pPr>
       <w:r>
-        <w:t>H5 · Caída de visibilidad en la fase de Decisión del embudo</w:t>
+        <w:t>H6 · Caída de visibilidad en la fase de Decisión del embudo</w:t>
       </w:r>
     </w:p>
     <w:p>
@@ -4586,7 +4618,7 @@
         <w:pStyle w:val="ListBullet"/>
       </w:pPr>
       <w:r>
-        <w:t>Prioridad: 5 · Tipo: embudo · Impacto: alto · Confianza: alta</w:t>
+        <w:t>Prioridad: 6 · Tipo: embudo · Impacto: alto · Confianza: alta</w:t>
       </w:r>
     </w:p>
     <w:p>
@@ -4610,7 +4642,7 @@
         <w:pStyle w:val="Heading2"/>
       </w:pPr>
       <w:r>
-        <w:t>H6 · Menor respaldo en rankings y prensa sanitaria frente al líder</w:t>
+        <w:t>H7 · Menor respaldo en rankings y prensa sanitaria frente al líder</w:t>
       </w:r>
     </w:p>
     <w:p>
@@ -4618,7 +4650,7 @@
         <w:pStyle w:val="ListBullet"/>
       </w:pPr>
       <w:r>
-        <w:t>Prioridad: 6 · Tipo: fuentes · Impacto: alto · Confianza: alta</w:t>
+        <w:t>Prioridad: 7 · Tipo: fuentes · Impacto: alto · Confianza: alta</w:t>
       </w:r>
     </w:p>
     <w:p>
@@ -4635,38 +4667,6 @@
       </w:pPr>
       <w:r>
         <w:t>Evidencia trazable: pct_fuentes_autoridad[marca=Clínica Alborada Visión] = 31.3 (T6, n=201, ej: EJ-0002, EJ-0038, EJ-0041); pct_fuentes_autoridad[marca=Grupo Hospitalario Valdecruz] = 38.3 (T6, n=290, ej: EJ-0001, EJ-0011, EJ-0018); calidad_media_fuente[marca=Clínica Alborada Visión] = 0.69 (T6, n=201, ej: EJ-0002, EJ-0038, EJ-0041)</w:t>
-      </w:r>
-    </w:p>
-    <w:p>
-      <w:pPr>
-        <w:pStyle w:val="Heading2"/>
-      </w:pPr>
-      <w:r>
-        <w:t>H7 · Fortaleza en reputación asistida: reputación sólida cuando la nombran; el problema es la visibilidad espontánea</w:t>
-      </w:r>
-    </w:p>
-    <w:p>
-      <w:pPr>
-        <w:pStyle w:val="ListBullet"/>
-      </w:pPr>
-      <w:r>
-        <w:t>Prioridad: 7 · Tipo: reputacion · Impacto: medio · Confianza: alta</w:t>
-      </w:r>
-    </w:p>
-    <w:p>
-      <w:pPr>
-        <w:pStyle w:val="ListBullet"/>
-      </w:pPr>
-      <w:r>
-        <w:t>Descripción: FORTALEZA: cuando se consulta por la marca en asistido, Clínica Alborada Visión presenta una reputación sólida con solo un 9.3% de menciones negativas y fuerza media de 1.21 (n=108), frente al 25.9% de Vistalia Oftalmología (n=108) y el 34.3% de Láser Nítida por seguimiento postoperatorio (n=108). Esto contrasta la hipótesis del cliente «con tan buenas reseñas deberíamos salir recomendados»: la reputación es sólida cuando la nombran, pero el problema es la visibilidad espontánea (38.8%, n=240).</w:t>
-      </w:r>
-    </w:p>
-    <w:p>
-      <w:pPr>
-        <w:pStyle w:val="ListBullet"/>
-      </w:pPr>
-      <w:r>
-        <w:t>Evidencia trazable: pct_negativo_asistida[marca=Clínica Alborada Visión] = 9.3 (T9, n=108, ej: EJ-0067, EJ-0079, EJ-0110); fuerza_media_asistida[marca=Clínica Alborada Visión] = 1.21 (T9, n=108, ej: EJ-0067, EJ-0079, EJ-0110); pct_negativo_asistida[marca=Vistalia Oftalmología] = 25.9 (T9, n=108, ej: EJ-0049, EJ-0074, EJ-0085); pct_negativo_asistida[marca=Láser Nítida] = 34.3 (T9, n=108, ej: EJ-0048, EJ-0058, EJ-0060); tasa_aparicion_espontanea[marca=Clínica Alborada Visión] = 38.8 (T1_espontanea, n=240, ej: EJ-0002, EJ-0003, EJ-0006)</w:t>
       </w:r>
     </w:p>
     <w:p>
@@ -4817,7 +4817,7 @@
           </w:tcPr>
           <w:p>
             <w:r>
-              <w:t>H3, H6</w:t>
+              <w:t>H4, H7</w:t>
             </w:r>
           </w:p>
         </w:tc>
@@ -4869,7 +4869,7 @@
           </w:tcPr>
           <w:p>
             <w:r>
-              <w:t>H3, H4</w:t>
+              <w:t>H4, H5</w:t>
             </w:r>
           </w:p>
         </w:tc>
@@ -4973,7 +4973,7 @@
           </w:tcPr>
           <w:p>
             <w:r>
-              <w:t>H2</w:t>
+              <w:t>H3</w:t>
             </w:r>
           </w:p>
         </w:tc>
@@ -5025,7 +5025,7 @@
           </w:tcPr>
           <w:p>
             <w:r>
-              <w:t>H5</w:t>
+              <w:t>H6</w:t>
             </w:r>
           </w:p>
         </w:tc>
@@ -5246,7 +5246,7 @@
           </w:tcPr>
           <w:p>
             <w:r>
-              <w:t>H6, H2, H5</w:t>
+              <w:t>H7, H3, H6</w:t>
             </w:r>
           </w:p>
         </w:tc>
@@ -5358,7 +5358,7 @@
           </w:tcPr>
           <w:p>
             <w:r>
-              <w:t>H2</w:t>
+              <w:t>H3</w:t>
             </w:r>
           </w:p>
         </w:tc>
@@ -5460,7 +5460,7 @@
           </w:tcPr>
           <w:p>
             <w:r>
-              <w:t>Normalización de entidad y NAP en directorios sanitarios citados</w:t>
+              <w:t>Normalización de entidad y NAP en directorios sanitarios citados (comparaclinicas.example, directoriomedico.example)</w:t>
             </w:r>
           </w:p>
         </w:tc>
@@ -5470,7 +5470,7 @@
           </w:tcPr>
           <w:p>
             <w:r>
-              <w:t>H6, H1, H4</w:t>
+              <w:t>H7, H1, H5</w:t>
             </w:r>
           </w:p>
         </w:tc>
@@ -5582,7 +5582,7 @@
           </w:tcPr>
           <w:p>
             <w:r>
-              <w:t>H2, H6</w:t>
+              <w:t>H3, H7</w:t>
             </w:r>
           </w:p>
         </w:tc>
@@ -5694,7 +5694,7 @@
           </w:tcPr>
           <w:p>
             <w:r>
-              <w:t>H4, H2</w:t>
+              <w:t>H5, H3</w:t>
             </w:r>
           </w:p>
         </w:tc>
@@ -5918,7 +5918,7 @@
           </w:tcPr>
           <w:p>
             <w:r>
-              <w:t>H6, H2</w:t>
+              <w:t>H7, H3</w:t>
             </w:r>
           </w:p>
         </w:tc>
@@ -6030,7 +6030,7 @@
           </w:tcPr>
           <w:p>
             <w:r>
-              <w:t>H5, H2</w:t>
+              <w:t>H6, H3</w:t>
             </w:r>
           </w:p>
         </w:tc>
@@ -6142,7 +6142,7 @@
           </w:tcPr>
           <w:p>
             <w:r>
-              <w:t>H5, H3</w:t>
+              <w:t>H6, H4</w:t>
             </w:r>
           </w:p>
         </w:tc>
@@ -6254,7 +6254,7 @@
           </w:tcPr>
           <w:p>
             <w:r>
-              <w:t>H7, H5</w:t>
+              <w:t>H2, H6</w:t>
             </w:r>
           </w:p>
         </w:tc>
@@ -6366,7 +6366,7 @@
           </w:tcPr>
           <w:p>
             <w:r>
-              <w:t>H5</w:t>
+              <w:t>H6</w:t>
             </w:r>
           </w:p>
         </w:tc>
@@ -6468,7 +6468,7 @@
           </w:tcPr>
           <w:p>
             <w:r>
-              <w:t>Plan de PR digital en prensa de salud citada (diariosalud, saludactual, bienestar-hoy)</w:t>
+              <w:t>Plan de PR digital en prensa de salud citada (bienestar-hoy.example, diariosalud.example, saludactual.example)</w:t>
             </w:r>
           </w:p>
         </w:tc>
@@ -6478,7 +6478,7 @@
           </w:tcPr>
           <w:p>
             <w:r>
-              <w:t>H6, H3, H4, H7</w:t>
+              <w:t>H7, H4, H5, H2</w:t>
             </w:r>
           </w:p>
         </w:tc>
@@ -6548,7 +6548,7 @@
           </w:tcPr>
           <w:p>
             <w:r>
-              <w:t>&gt;= 6 apariciones editoriales en diariosalud.example, saludactual.example y bienestar-hoy.example</w:t>
+              <w:t>&gt;= 6 apariciones editoriales en bienestar-hoy.example, diariosalud.example y saludactual.example</w:t>
             </w:r>
           </w:p>
         </w:tc>
@@ -6580,7 +6580,7 @@
           </w:tcPr>
           <w:p>
             <w:r>
-              <w:t>Dossier y candidatura a rankings y guías sectoriales (rankingclinicas, guiaoftalmologia, colegio)</w:t>
+              <w:t>Dossier y candidatura a rankings y guías sectoriales (colegiooftalmologos.example, guiaoftalmologia.example, rankingclinicas.example)</w:t>
             </w:r>
           </w:p>
         </w:tc>
@@ -6590,7 +6590,7 @@
           </w:tcPr>
           <w:p>
             <w:r>
-              <w:t>H6, H3</w:t>
+              <w:t>H7, H4</w:t>
             </w:r>
           </w:p>
         </w:tc>
@@ -6702,7 +6702,7 @@
           </w:tcPr>
           <w:p>
             <w:r>
-              <w:t>H1, H2, H5, H3, H6, H7, H4</w:t>
+              <w:t>H1, H3, H6, H4, H7, H2, H5</w:t>
             </w:r>
           </w:p>
         </w:tc>
@@ -7660,7 +7660,7 @@
           </w:tcPr>
           <w:p>
             <w:r>
-              <w:t>H2 (motor)</w:t>
+              <w:t>H2 (reputacion)</w:t>
             </w:r>
           </w:p>
         </w:tc>
@@ -7670,7 +7670,7 @@
           </w:tcPr>
           <w:p>
             <w:r>
-              <w:t>tasa_aparicion_espontanea[motor=ChatGPT]</w:t>
+              <w:t>pct_negativo_asistida[marca=Clínica Alborada Visión]</w:t>
             </w:r>
           </w:p>
         </w:tc>
@@ -7680,7 +7680,7 @@
           </w:tcPr>
           <w:p>
             <w:r>
-              <w:t>18.3</w:t>
+              <w:t>9.3</w:t>
             </w:r>
           </w:p>
         </w:tc>
@@ -7690,7 +7690,7 @@
           </w:tcPr>
           <w:p>
             <w:r>
-              <w:t>60</w:t>
+              <w:t>108</w:t>
             </w:r>
           </w:p>
         </w:tc>
@@ -7700,7 +7700,7 @@
           </w:tcPr>
           <w:p>
             <w:r>
-              <w:t>T2</w:t>
+              <w:t>T9</w:t>
             </w:r>
           </w:p>
         </w:tc>
@@ -7710,7 +7710,7 @@
           </w:tcPr>
           <w:p>
             <w:r>
-              <w:t>EJ-0025, EJ-0153, EJ-0193</w:t>
+              <w:t>EJ-0067, EJ-0079, EJ-0110</w:t>
             </w:r>
           </w:p>
         </w:tc>
@@ -7722,7 +7722,7 @@
           </w:tcPr>
           <w:p>
             <w:r>
-              <w:t>H2 (motor)</w:t>
+              <w:t>H2 (reputacion)</w:t>
             </w:r>
           </w:p>
         </w:tc>
@@ -7732,7 +7732,7 @@
           </w:tcPr>
           <w:p>
             <w:r>
-              <w:t>tasa_aparicion_espontanea[motor=Claude]</w:t>
+              <w:t>fuerza_media_asistida[marca=Clínica Alborada Visión]</w:t>
             </w:r>
           </w:p>
         </w:tc>
@@ -7742,7 +7742,7 @@
           </w:tcPr>
           <w:p>
             <w:r>
-              <w:t>15.0</w:t>
+              <w:t>1.21</w:t>
             </w:r>
           </w:p>
         </w:tc>
@@ -7752,7 +7752,7 @@
           </w:tcPr>
           <w:p>
             <w:r>
-              <w:t>60</w:t>
+              <w:t>108</w:t>
             </w:r>
           </w:p>
         </w:tc>
@@ -7762,7 +7762,7 @@
           </w:tcPr>
           <w:p>
             <w:r>
-              <w:t>T2</w:t>
+              <w:t>T9</w:t>
             </w:r>
           </w:p>
         </w:tc>
@@ -7772,7 +7772,7 @@
           </w:tcPr>
           <w:p>
             <w:r>
-              <w:t>EJ-0012, EJ-0176, EJ-0204</w:t>
+              <w:t>EJ-0067, EJ-0079, EJ-0110</w:t>
             </w:r>
           </w:p>
         </w:tc>
@@ -7784,7 +7784,7 @@
           </w:tcPr>
           <w:p>
             <w:r>
-              <w:t>H2 (motor)</w:t>
+              <w:t>H2 (reputacion)</w:t>
             </w:r>
           </w:p>
         </w:tc>
@@ -7794,7 +7794,7 @@
           </w:tcPr>
           <w:p>
             <w:r>
-              <w:t>tasa_aparicion_espontanea[motor=Perplexity]</w:t>
+              <w:t>pct_negativo_asistida[marca=Vistalia Oftalmología]</w:t>
             </w:r>
           </w:p>
         </w:tc>
@@ -7804,7 +7804,7 @@
           </w:tcPr>
           <w:p>
             <w:r>
-              <w:t>65.0</w:t>
+              <w:t>25.9</w:t>
             </w:r>
           </w:p>
         </w:tc>
@@ -7814,7 +7814,7 @@
           </w:tcPr>
           <w:p>
             <w:r>
-              <w:t>60</w:t>
+              <w:t>108</w:t>
             </w:r>
           </w:p>
         </w:tc>
@@ -7824,7 +7824,7 @@
           </w:tcPr>
           <w:p>
             <w:r>
-              <w:t>T2</w:t>
+              <w:t>T9</w:t>
             </w:r>
           </w:p>
         </w:tc>
@@ -7834,7 +7834,7 @@
           </w:tcPr>
           <w:p>
             <w:r>
-              <w:t>EJ-0003, EJ-0007, EJ-0011</w:t>
+              <w:t>EJ-0049, EJ-0074, EJ-0085</w:t>
             </w:r>
           </w:p>
         </w:tc>
@@ -7846,7 +7846,7 @@
           </w:tcPr>
           <w:p>
             <w:r>
-              <w:t>H2 (motor)</w:t>
+              <w:t>H2 (reputacion)</w:t>
             </w:r>
           </w:p>
         </w:tc>
@@ -7856,7 +7856,7 @@
           </w:tcPr>
           <w:p>
             <w:r>
-              <w:t>tasa_aparicion_espontanea[motor=Gemini]</w:t>
+              <w:t>pct_negativo_asistida[marca=Láser Nítida]</w:t>
             </w:r>
           </w:p>
         </w:tc>
@@ -7866,7 +7866,7 @@
           </w:tcPr>
           <w:p>
             <w:r>
-              <w:t>56.7</w:t>
+              <w:t>34.3</w:t>
             </w:r>
           </w:p>
         </w:tc>
@@ -7876,7 +7876,7 @@
           </w:tcPr>
           <w:p>
             <w:r>
-              <w:t>60</w:t>
+              <w:t>108</w:t>
             </w:r>
           </w:p>
         </w:tc>
@@ -7886,7 +7886,7 @@
           </w:tcPr>
           <w:p>
             <w:r>
-              <w:t>T2</w:t>
+              <w:t>T9</w:t>
             </w:r>
           </w:p>
         </w:tc>
@@ -7896,7 +7896,7 @@
           </w:tcPr>
           <w:p>
             <w:r>
-              <w:t>EJ-0002, EJ-0006, EJ-0010</w:t>
+              <w:t>EJ-0048, EJ-0058, EJ-0060</w:t>
             </w:r>
           </w:p>
         </w:tc>
@@ -7908,7 +7908,7 @@
           </w:tcPr>
           <w:p>
             <w:r>
-              <w:t>H3 (competencia)</w:t>
+              <w:t>H2 (reputacion)</w:t>
             </w:r>
           </w:p>
         </w:tc>
@@ -7918,7 +7918,7 @@
           </w:tcPr>
           <w:p>
             <w:r>
-              <w:t>score_espontaneo[marca=Clínica Alborada Visión]</w:t>
+              <w:t>tasa_aparicion_espontanea[marca=Clínica Alborada Visión]</w:t>
             </w:r>
           </w:p>
         </w:tc>
@@ -7928,7 +7928,7 @@
           </w:tcPr>
           <w:p>
             <w:r>
-              <w:t>27.97</w:t>
+              <w:t>38.8</w:t>
             </w:r>
           </w:p>
         </w:tc>
@@ -7970,7 +7970,7 @@
           </w:tcPr>
           <w:p>
             <w:r>
-              <w:t>H3 (competencia)</w:t>
+              <w:t>H3 (motor)</w:t>
             </w:r>
           </w:p>
         </w:tc>
@@ -7980,7 +7980,7 @@
           </w:tcPr>
           <w:p>
             <w:r>
-              <w:t>tasa_aparicion_espontanea[marca=Clínica Alborada Visión]</w:t>
+              <w:t>tasa_aparicion_espontanea[motor=ChatGPT]</w:t>
             </w:r>
           </w:p>
         </w:tc>
@@ -7990,7 +7990,7 @@
           </w:tcPr>
           <w:p>
             <w:r>
-              <w:t>38.8</w:t>
+              <w:t>18.3</w:t>
             </w:r>
           </w:p>
         </w:tc>
@@ -8000,7 +8000,7 @@
           </w:tcPr>
           <w:p>
             <w:r>
-              <w:t>240</w:t>
+              <w:t>60</w:t>
             </w:r>
           </w:p>
         </w:tc>
@@ -8010,7 +8010,7 @@
           </w:tcPr>
           <w:p>
             <w:r>
-              <w:t>T1_espontanea</w:t>
+              <w:t>T2</w:t>
             </w:r>
           </w:p>
         </w:tc>
@@ -8020,7 +8020,7 @@
           </w:tcPr>
           <w:p>
             <w:r>
-              <w:t>EJ-0002, EJ-0003, EJ-0006</w:t>
+              <w:t>EJ-0025, EJ-0153, EJ-0193</w:t>
             </w:r>
           </w:p>
         </w:tc>
@@ -8032,7 +8032,7 @@
           </w:tcPr>
           <w:p>
             <w:r>
-              <w:t>H3 (competencia)</w:t>
+              <w:t>H3 (motor)</w:t>
             </w:r>
           </w:p>
         </w:tc>
@@ -8042,7 +8042,7 @@
           </w:tcPr>
           <w:p>
             <w:r>
-              <w:t>score_espontaneo[marca=Grupo Hospitalario Valdecruz]</w:t>
+              <w:t>tasa_aparicion_espontanea[motor=Claude]</w:t>
             </w:r>
           </w:p>
         </w:tc>
@@ -8052,7 +8052,7 @@
           </w:tcPr>
           <w:p>
             <w:r>
-              <w:t>75.02</w:t>
+              <w:t>15.0</w:t>
             </w:r>
           </w:p>
         </w:tc>
@@ -8062,7 +8062,7 @@
           </w:tcPr>
           <w:p>
             <w:r>
-              <w:t>240</w:t>
+              <w:t>60</w:t>
             </w:r>
           </w:p>
         </w:tc>
@@ -8072,7 +8072,7 @@
           </w:tcPr>
           <w:p>
             <w:r>
-              <w:t>T1_espontanea</w:t>
+              <w:t>T2</w:t>
             </w:r>
           </w:p>
         </w:tc>
@@ -8082,7 +8082,7 @@
           </w:tcPr>
           <w:p>
             <w:r>
-              <w:t>EJ-0001, EJ-0002, EJ-0003</w:t>
+              <w:t>EJ-0012, EJ-0176, EJ-0204</w:t>
             </w:r>
           </w:p>
         </w:tc>
@@ -8094,7 +8094,7 @@
           </w:tcPr>
           <w:p>
             <w:r>
-              <w:t>H3 (competencia)</w:t>
+              <w:t>H3 (motor)</w:t>
             </w:r>
           </w:p>
         </w:tc>
@@ -8104,7 +8104,7 @@
           </w:tcPr>
           <w:p>
             <w:r>
-              <w:t>tasa_aparicion_espontanea[marca=Grupo Hospitalario Valdecruz]</w:t>
+              <w:t>tasa_aparicion_espontanea[motor=Perplexity]</w:t>
             </w:r>
           </w:p>
         </w:tc>
@@ -8114,7 +8114,7 @@
           </w:tcPr>
           <w:p>
             <w:r>
-              <w:t>90.8</w:t>
+              <w:t>65.0</w:t>
             </w:r>
           </w:p>
         </w:tc>
@@ -8124,7 +8124,7 @@
           </w:tcPr>
           <w:p>
             <w:r>
-              <w:t>240</w:t>
+              <w:t>60</w:t>
             </w:r>
           </w:p>
         </w:tc>
@@ -8134,7 +8134,7 @@
           </w:tcPr>
           <w:p>
             <w:r>
-              <w:t>T1_espontanea</w:t>
+              <w:t>T2</w:t>
             </w:r>
           </w:p>
         </w:tc>
@@ -8144,7 +8144,7 @@
           </w:tcPr>
           <w:p>
             <w:r>
-              <w:t>EJ-0001, EJ-0002, EJ-0003</w:t>
+              <w:t>EJ-0003, EJ-0007, EJ-0011</w:t>
             </w:r>
           </w:p>
         </w:tc>
@@ -8156,7 +8156,7 @@
           </w:tcPr>
           <w:p>
             <w:r>
-              <w:t>H3 (competencia)</w:t>
+              <w:t>H3 (motor)</w:t>
             </w:r>
           </w:p>
         </w:tc>
@@ -8166,7 +8166,7 @@
           </w:tcPr>
           <w:p>
             <w:r>
-              <w:t>score_espontaneo[marca=Instituto Oftálmico Tramuntana]</w:t>
+              <w:t>tasa_aparicion_espontanea[motor=Gemini]</w:t>
             </w:r>
           </w:p>
         </w:tc>
@@ -8176,7 +8176,7 @@
           </w:tcPr>
           <w:p>
             <w:r>
-              <w:t>51.7</w:t>
+              <w:t>56.7</w:t>
             </w:r>
           </w:p>
         </w:tc>
@@ -8186,7 +8186,7 @@
           </w:tcPr>
           <w:p>
             <w:r>
-              <w:t>240</w:t>
+              <w:t>60</w:t>
             </w:r>
           </w:p>
         </w:tc>
@@ -8196,7 +8196,7 @@
           </w:tcPr>
           <w:p>
             <w:r>
-              <w:t>T1_espontanea</w:t>
+              <w:t>T2</w:t>
             </w:r>
           </w:p>
         </w:tc>
@@ -8206,7 +8206,7 @@
           </w:tcPr>
           <w:p>
             <w:r>
-              <w:t>EJ-0001, EJ-0002, EJ-0003</w:t>
+              <w:t>EJ-0002, EJ-0006, EJ-0010</w:t>
             </w:r>
           </w:p>
         </w:tc>
@@ -8218,7 +8218,7 @@
           </w:tcPr>
           <w:p>
             <w:r>
-              <w:t>H3 (competencia)</w:t>
+              <w:t>H4 (competencia)</w:t>
             </w:r>
           </w:p>
         </w:tc>
@@ -8228,7 +8228,7 @@
           </w:tcPr>
           <w:p>
             <w:r>
-              <w:t>tasa_aparicion_espontanea[marca=Instituto Oftálmico Tramuntana]</w:t>
+              <w:t>score_espontaneo[marca=Clínica Alborada Visión]</w:t>
             </w:r>
           </w:p>
         </w:tc>
@@ -8238,7 +8238,7 @@
           </w:tcPr>
           <w:p>
             <w:r>
-              <w:t>68.8</w:t>
+              <w:t>27.97</w:t>
             </w:r>
           </w:p>
         </w:tc>
@@ -8268,7 +8268,7 @@
           </w:tcPr>
           <w:p>
             <w:r>
-              <w:t>EJ-0001, EJ-0002, EJ-0003</w:t>
+              <w:t>EJ-0002, EJ-0003, EJ-0006</w:t>
             </w:r>
           </w:p>
         </w:tc>
@@ -8280,7 +8280,7 @@
           </w:tcPr>
           <w:p>
             <w:r>
-              <w:t>H4 (brief_vs_datos)</w:t>
+              <w:t>H4 (competencia)</w:t>
             </w:r>
           </w:p>
         </w:tc>
@@ -8290,7 +8290,7 @@
           </w:tcPr>
           <w:p>
             <w:r>
-              <w:t>tasa_aparicion_espontanea[marca=Vistalia Oftalmología]</w:t>
+              <w:t>tasa_aparicion_espontanea[marca=Clínica Alborada Visión]</w:t>
             </w:r>
           </w:p>
         </w:tc>
@@ -8300,7 +8300,7 @@
           </w:tcPr>
           <w:p>
             <w:r>
-              <w:t>41.2</w:t>
+              <w:t>38.8</w:t>
             </w:r>
           </w:p>
         </w:tc>
@@ -8330,7 +8330,7 @@
           </w:tcPr>
           <w:p>
             <w:r>
-              <w:t>EJ-0001, EJ-0002, EJ-0003</w:t>
+              <w:t>EJ-0002, EJ-0003, EJ-0006</w:t>
             </w:r>
           </w:p>
         </w:tc>
@@ -8342,7 +8342,7 @@
           </w:tcPr>
           <w:p>
             <w:r>
-              <w:t>H4 (brief_vs_datos)</w:t>
+              <w:t>H4 (competencia)</w:t>
             </w:r>
           </w:p>
         </w:tc>
@@ -8352,7 +8352,7 @@
           </w:tcPr>
           <w:p>
             <w:r>
-              <w:t>tasa_aparicion_espontanea[marca=Grupo Hospitalario Valdecruz]</w:t>
+              <w:t>score_espontaneo[marca=Grupo Hospitalario Valdecruz]</w:t>
             </w:r>
           </w:p>
         </w:tc>
@@ -8362,7 +8362,7 @@
           </w:tcPr>
           <w:p>
             <w:r>
-              <w:t>90.8</w:t>
+              <w:t>75.02</w:t>
             </w:r>
           </w:p>
         </w:tc>
@@ -8404,7 +8404,7 @@
           </w:tcPr>
           <w:p>
             <w:r>
-              <w:t>H4 (brief_vs_datos)</w:t>
+              <w:t>H4 (competencia)</w:t>
             </w:r>
           </w:p>
         </w:tc>
@@ -8414,7 +8414,7 @@
           </w:tcPr>
           <w:p>
             <w:r>
-              <w:t>pct_recomendacion_activa_espontanea[marca=Clínica Alborada Visión]</w:t>
+              <w:t>tasa_aparicion_espontanea[marca=Grupo Hospitalario Valdecruz]</w:t>
             </w:r>
           </w:p>
         </w:tc>
@@ -8424,7 +8424,7 @@
           </w:tcPr>
           <w:p>
             <w:r>
-              <w:t>6.7</w:t>
+              <w:t>90.8</w:t>
             </w:r>
           </w:p>
         </w:tc>
@@ -8454,7 +8454,7 @@
           </w:tcPr>
           <w:p>
             <w:r>
-              <w:t>EJ-0002, EJ-0003, EJ-0006</w:t>
+              <w:t>EJ-0001, EJ-0002, EJ-0003</w:t>
             </w:r>
           </w:p>
         </w:tc>
@@ -8466,7 +8466,7 @@
           </w:tcPr>
           <w:p>
             <w:r>
-              <w:t>H5 (embudo)</w:t>
+              <w:t>H4 (competencia)</w:t>
             </w:r>
           </w:p>
         </w:tc>
@@ -8476,7 +8476,7 @@
           </w:tcPr>
           <w:p>
             <w:r>
-              <w:t>tasa_aparicion_espontanea[intencion=Descubrimiento]</w:t>
+              <w:t>score_espontaneo[marca=Instituto Oftálmico Tramuntana]</w:t>
             </w:r>
           </w:p>
         </w:tc>
@@ -8486,7 +8486,7 @@
           </w:tcPr>
           <w:p>
             <w:r>
-              <w:t>44.7</w:t>
+              <w:t>51.7</w:t>
             </w:r>
           </w:p>
         </w:tc>
@@ -8496,7 +8496,7 @@
           </w:tcPr>
           <w:p>
             <w:r>
-              <w:t>132</w:t>
+              <w:t>240</w:t>
             </w:r>
           </w:p>
         </w:tc>
@@ -8506,7 +8506,7 @@
           </w:tcPr>
           <w:p>
             <w:r>
-              <w:t>T3</w:t>
+              <w:t>T1_espontanea</w:t>
             </w:r>
           </w:p>
         </w:tc>
@@ -8516,7 +8516,7 @@
           </w:tcPr>
           <w:p>
             <w:r>
-              <w:t>EJ-0002, EJ-0003, EJ-0006</w:t>
+              <w:t>EJ-0001, EJ-0002, EJ-0003</w:t>
             </w:r>
           </w:p>
         </w:tc>
@@ -8528,7 +8528,7 @@
           </w:tcPr>
           <w:p>
             <w:r>
-              <w:t>H5 (embudo)</w:t>
+              <w:t>H4 (competencia)</w:t>
             </w:r>
           </w:p>
         </w:tc>
@@ -8538,7 +8538,7 @@
           </w:tcPr>
           <w:p>
             <w:r>
-              <w:t>tasa_aparicion_espontanea[intencion=Decisión]</w:t>
+              <w:t>tasa_aparicion_espontanea[marca=Instituto Oftálmico Tramuntana]</w:t>
             </w:r>
           </w:p>
         </w:tc>
@@ -8548,7 +8548,7 @@
           </w:tcPr>
           <w:p>
             <w:r>
-              <w:t>25.0</w:t>
+              <w:t>68.8</w:t>
             </w:r>
           </w:p>
         </w:tc>
@@ -8558,7 +8558,7 @@
           </w:tcPr>
           <w:p>
             <w:r>
-              <w:t>48</w:t>
+              <w:t>240</w:t>
             </w:r>
           </w:p>
         </w:tc>
@@ -8568,7 +8568,7 @@
           </w:tcPr>
           <w:p>
             <w:r>
-              <w:t>T3</w:t>
+              <w:t>T1_espontanea</w:t>
             </w:r>
           </w:p>
         </w:tc>
@@ -8578,7 +8578,7 @@
           </w:tcPr>
           <w:p>
             <w:r>
-              <w:t>EJ-0153, EJ-0155, EJ-0176</w:t>
+              <w:t>EJ-0001, EJ-0002, EJ-0003</w:t>
             </w:r>
           </w:p>
         </w:tc>
@@ -8590,7 +8590,7 @@
           </w:tcPr>
           <w:p>
             <w:r>
-              <w:t>H5 (embudo)</w:t>
+              <w:t>H5 (brief_vs_datos)</w:t>
             </w:r>
           </w:p>
         </w:tc>
@@ -8600,7 +8600,7 @@
           </w:tcPr>
           <w:p>
             <w:r>
-              <w:t>tasa_aparicion_lider[intencion=Decisión,lider=Grupo Hospitalario Valdecruz]</w:t>
+              <w:t>tasa_aparicion_espontanea[marca=Vistalia Oftalmología]</w:t>
             </w:r>
           </w:p>
         </w:tc>
@@ -8610,7 +8610,7 @@
           </w:tcPr>
           <w:p>
             <w:r>
-              <w:t>97.9</w:t>
+              <w:t>41.2</w:t>
             </w:r>
           </w:p>
         </w:tc>
@@ -8620,7 +8620,7 @@
           </w:tcPr>
           <w:p>
             <w:r>
-              <w:t>48</w:t>
+              <w:t>240</w:t>
             </w:r>
           </w:p>
         </w:tc>
@@ -8630,7 +8630,7 @@
           </w:tcPr>
           <w:p>
             <w:r>
-              <w:t>T11</w:t>
+              <w:t>T1_espontanea</w:t>
             </w:r>
           </w:p>
         </w:tc>
@@ -8640,7 +8640,7 @@
           </w:tcPr>
           <w:p>
             <w:r>
-              <w:t>EJ-0153, EJ-0155, EJ-0176</w:t>
+              <w:t>EJ-0001, EJ-0002, EJ-0003</w:t>
             </w:r>
           </w:p>
         </w:tc>
@@ -8652,7 +8652,7 @@
           </w:tcPr>
           <w:p>
             <w:r>
-              <w:t>H6 (fuentes)</w:t>
+              <w:t>H5 (brief_vs_datos)</w:t>
             </w:r>
           </w:p>
         </w:tc>
@@ -8662,7 +8662,7 @@
           </w:tcPr>
           <w:p>
             <w:r>
-              <w:t>pct_fuentes_autoridad[marca=Clínica Alborada Visión]</w:t>
+              <w:t>tasa_aparicion_espontanea[marca=Grupo Hospitalario Valdecruz]</w:t>
             </w:r>
           </w:p>
         </w:tc>
@@ -8672,7 +8672,7 @@
           </w:tcPr>
           <w:p>
             <w:r>
-              <w:t>31.3</w:t>
+              <w:t>90.8</w:t>
             </w:r>
           </w:p>
         </w:tc>
@@ -8682,7 +8682,7 @@
           </w:tcPr>
           <w:p>
             <w:r>
-              <w:t>201</w:t>
+              <w:t>240</w:t>
             </w:r>
           </w:p>
         </w:tc>
@@ -8692,7 +8692,7 @@
           </w:tcPr>
           <w:p>
             <w:r>
-              <w:t>T6</w:t>
+              <w:t>T1_espontanea</w:t>
             </w:r>
           </w:p>
         </w:tc>
@@ -8702,7 +8702,7 @@
           </w:tcPr>
           <w:p>
             <w:r>
-              <w:t>EJ-0002, EJ-0038, EJ-0041</w:t>
+              <w:t>EJ-0001, EJ-0002, EJ-0003</w:t>
             </w:r>
           </w:p>
         </w:tc>
@@ -8714,7 +8714,7 @@
           </w:tcPr>
           <w:p>
             <w:r>
-              <w:t>H6 (fuentes)</w:t>
+              <w:t>H5 (brief_vs_datos)</w:t>
             </w:r>
           </w:p>
         </w:tc>
@@ -8724,7 +8724,7 @@
           </w:tcPr>
           <w:p>
             <w:r>
-              <w:t>pct_fuentes_autoridad[marca=Grupo Hospitalario Valdecruz]</w:t>
+              <w:t>pct_recomendacion_activa_espontanea[marca=Clínica Alborada Visión]</w:t>
             </w:r>
           </w:p>
         </w:tc>
@@ -8734,7 +8734,7 @@
           </w:tcPr>
           <w:p>
             <w:r>
-              <w:t>38.3</w:t>
+              <w:t>6.7</w:t>
             </w:r>
           </w:p>
         </w:tc>
@@ -8744,7 +8744,7 @@
           </w:tcPr>
           <w:p>
             <w:r>
-              <w:t>290</w:t>
+              <w:t>240</w:t>
             </w:r>
           </w:p>
         </w:tc>
@@ -8754,7 +8754,7 @@
           </w:tcPr>
           <w:p>
             <w:r>
-              <w:t>T6</w:t>
+              <w:t>T1_espontanea</w:t>
             </w:r>
           </w:p>
         </w:tc>
@@ -8764,7 +8764,7 @@
           </w:tcPr>
           <w:p>
             <w:r>
-              <w:t>EJ-0001, EJ-0011, EJ-0018</w:t>
+              <w:t>EJ-0002, EJ-0003, EJ-0006</w:t>
             </w:r>
           </w:p>
         </w:tc>
@@ -8776,7 +8776,7 @@
           </w:tcPr>
           <w:p>
             <w:r>
-              <w:t>H6 (fuentes)</w:t>
+              <w:t>H6 (embudo)</w:t>
             </w:r>
           </w:p>
         </w:tc>
@@ -8786,7 +8786,7 @@
           </w:tcPr>
           <w:p>
             <w:r>
-              <w:t>calidad_media_fuente[marca=Clínica Alborada Visión]</w:t>
+              <w:t>tasa_aparicion_espontanea[intencion=Descubrimiento]</w:t>
             </w:r>
           </w:p>
         </w:tc>
@@ -8796,7 +8796,7 @@
           </w:tcPr>
           <w:p>
             <w:r>
-              <w:t>0.69</w:t>
+              <w:t>44.7</w:t>
             </w:r>
           </w:p>
         </w:tc>
@@ -8806,7 +8806,7 @@
           </w:tcPr>
           <w:p>
             <w:r>
-              <w:t>201</w:t>
+              <w:t>132</w:t>
             </w:r>
           </w:p>
         </w:tc>
@@ -8816,7 +8816,7 @@
           </w:tcPr>
           <w:p>
             <w:r>
-              <w:t>T6</w:t>
+              <w:t>T3</w:t>
             </w:r>
           </w:p>
         </w:tc>
@@ -8826,7 +8826,7 @@
           </w:tcPr>
           <w:p>
             <w:r>
-              <w:t>EJ-0002, EJ-0038, EJ-0041</w:t>
+              <w:t>EJ-0002, EJ-0003, EJ-0006</w:t>
             </w:r>
           </w:p>
         </w:tc>
@@ -8838,7 +8838,7 @@
           </w:tcPr>
           <w:p>
             <w:r>
-              <w:t>H7 (reputacion)</w:t>
+              <w:t>H6 (embudo)</w:t>
             </w:r>
           </w:p>
         </w:tc>
@@ -8848,7 +8848,7 @@
           </w:tcPr>
           <w:p>
             <w:r>
-              <w:t>pct_negativo_asistida[marca=Clínica Alborada Visión]</w:t>
+              <w:t>tasa_aparicion_espontanea[intencion=Decisión]</w:t>
             </w:r>
           </w:p>
         </w:tc>
@@ -8858,7 +8858,7 @@
           </w:tcPr>
           <w:p>
             <w:r>
-              <w:t>9.3</w:t>
+              <w:t>25.0</w:t>
             </w:r>
           </w:p>
         </w:tc>
@@ -8868,7 +8868,7 @@
           </w:tcPr>
           <w:p>
             <w:r>
-              <w:t>108</w:t>
+              <w:t>48</w:t>
             </w:r>
           </w:p>
         </w:tc>
@@ -8878,7 +8878,7 @@
           </w:tcPr>
           <w:p>
             <w:r>
-              <w:t>T9</w:t>
+              <w:t>T3</w:t>
             </w:r>
           </w:p>
         </w:tc>
@@ -8888,7 +8888,7 @@
           </w:tcPr>
           <w:p>
             <w:r>
-              <w:t>EJ-0067, EJ-0079, EJ-0110</w:t>
+              <w:t>EJ-0153, EJ-0155, EJ-0176</w:t>
             </w:r>
           </w:p>
         </w:tc>
@@ -8900,7 +8900,7 @@
           </w:tcPr>
           <w:p>
             <w:r>
-              <w:t>H7 (reputacion)</w:t>
+              <w:t>H6 (embudo)</w:t>
             </w:r>
           </w:p>
         </w:tc>
@@ -8910,7 +8910,7 @@
           </w:tcPr>
           <w:p>
             <w:r>
-              <w:t>fuerza_media_asistida[marca=Clínica Alborada Visión]</w:t>
+              <w:t>tasa_aparicion_lider[intencion=Decisión,lider=Grupo Hospitalario Valdecruz]</w:t>
             </w:r>
           </w:p>
         </w:tc>
@@ -8920,7 +8920,7 @@
           </w:tcPr>
           <w:p>
             <w:r>
-              <w:t>1.21</w:t>
+              <w:t>97.9</w:t>
             </w:r>
           </w:p>
         </w:tc>
@@ -8930,7 +8930,7 @@
           </w:tcPr>
           <w:p>
             <w:r>
-              <w:t>108</w:t>
+              <w:t>48</w:t>
             </w:r>
           </w:p>
         </w:tc>
@@ -8940,7 +8940,7 @@
           </w:tcPr>
           <w:p>
             <w:r>
-              <w:t>T9</w:t>
+              <w:t>T11</w:t>
             </w:r>
           </w:p>
         </w:tc>
@@ -8950,7 +8950,7 @@
           </w:tcPr>
           <w:p>
             <w:r>
-              <w:t>EJ-0067, EJ-0079, EJ-0110</w:t>
+              <w:t>EJ-0153, EJ-0155, EJ-0176</w:t>
             </w:r>
           </w:p>
         </w:tc>
@@ -8962,7 +8962,7 @@
           </w:tcPr>
           <w:p>
             <w:r>
-              <w:t>H7 (reputacion)</w:t>
+              <w:t>H7 (fuentes)</w:t>
             </w:r>
           </w:p>
         </w:tc>
@@ -8972,7 +8972,7 @@
           </w:tcPr>
           <w:p>
             <w:r>
-              <w:t>pct_negativo_asistida[marca=Vistalia Oftalmología]</w:t>
+              <w:t>pct_fuentes_autoridad[marca=Clínica Alborada Visión]</w:t>
             </w:r>
           </w:p>
         </w:tc>
@@ -8982,7 +8982,7 @@
           </w:tcPr>
           <w:p>
             <w:r>
-              <w:t>25.9</w:t>
+              <w:t>31.3</w:t>
             </w:r>
           </w:p>
         </w:tc>
@@ -8992,7 +8992,7 @@
           </w:tcPr>
           <w:p>
             <w:r>
-              <w:t>108</w:t>
+              <w:t>201</w:t>
             </w:r>
           </w:p>
         </w:tc>
@@ -9002,7 +9002,7 @@
           </w:tcPr>
           <w:p>
             <w:r>
-              <w:t>T9</w:t>
+              <w:t>T6</w:t>
             </w:r>
           </w:p>
         </w:tc>
@@ -9012,7 +9012,7 @@
           </w:tcPr>
           <w:p>
             <w:r>
-              <w:t>EJ-0049, EJ-0074, EJ-0085</w:t>
+              <w:t>EJ-0002, EJ-0038, EJ-0041</w:t>
             </w:r>
           </w:p>
         </w:tc>
@@ -9024,7 +9024,7 @@
           </w:tcPr>
           <w:p>
             <w:r>
-              <w:t>H7 (reputacion)</w:t>
+              <w:t>H7 (fuentes)</w:t>
             </w:r>
           </w:p>
         </w:tc>
@@ -9034,7 +9034,7 @@
           </w:tcPr>
           <w:p>
             <w:r>
-              <w:t>pct_negativo_asistida[marca=Láser Nítida]</w:t>
+              <w:t>pct_fuentes_autoridad[marca=Grupo Hospitalario Valdecruz]</w:t>
             </w:r>
           </w:p>
         </w:tc>
@@ -9044,7 +9044,7 @@
           </w:tcPr>
           <w:p>
             <w:r>
-              <w:t>34.3</w:t>
+              <w:t>38.3</w:t>
             </w:r>
           </w:p>
         </w:tc>
@@ -9054,7 +9054,7 @@
           </w:tcPr>
           <w:p>
             <w:r>
-              <w:t>108</w:t>
+              <w:t>290</w:t>
             </w:r>
           </w:p>
         </w:tc>
@@ -9064,7 +9064,7 @@
           </w:tcPr>
           <w:p>
             <w:r>
-              <w:t>T9</w:t>
+              <w:t>T6</w:t>
             </w:r>
           </w:p>
         </w:tc>
@@ -9074,7 +9074,7 @@
           </w:tcPr>
           <w:p>
             <w:r>
-              <w:t>EJ-0048, EJ-0058, EJ-0060</w:t>
+              <w:t>EJ-0001, EJ-0011, EJ-0018</w:t>
             </w:r>
           </w:p>
         </w:tc>
@@ -9086,7 +9086,7 @@
           </w:tcPr>
           <w:p>
             <w:r>
-              <w:t>H7 (reputacion)</w:t>
+              <w:t>H7 (fuentes)</w:t>
             </w:r>
           </w:p>
         </w:tc>
@@ -9096,7 +9096,7 @@
           </w:tcPr>
           <w:p>
             <w:r>
-              <w:t>tasa_aparicion_espontanea[marca=Clínica Alborada Visión]</w:t>
+              <w:t>calidad_media_fuente[marca=Clínica Alborada Visión]</w:t>
             </w:r>
           </w:p>
         </w:tc>
@@ -9106,7 +9106,7 @@
           </w:tcPr>
           <w:p>
             <w:r>
-              <w:t>38.8</w:t>
+              <w:t>0.69</w:t>
             </w:r>
           </w:p>
         </w:tc>
@@ -9116,7 +9116,7 @@
           </w:tcPr>
           <w:p>
             <w:r>
-              <w:t>240</w:t>
+              <w:t>201</w:t>
             </w:r>
           </w:p>
         </w:tc>
@@ -9126,7 +9126,7 @@
           </w:tcPr>
           <w:p>
             <w:r>
-              <w:t>T1_espontanea</w:t>
+              <w:t>T6</w:t>
             </w:r>
           </w:p>
         </w:tc>
@@ -9136,7 +9136,7 @@
           </w:tcPr>
           <w:p>
             <w:r>
-              <w:t>EJ-0002, EJ-0003, EJ-0006</w:t>
+              <w:t>EJ-0002, EJ-0038, EJ-0041</w:t>
             </w:r>
           </w:p>
         </w:tc>
@@ -9165,7 +9165,7 @@
         <w:color w:val="646464"/>
         <w:sz w:val="17"/>
       </w:rPr>
-      <w:t>Datos sintéticos · demo · 2026-10-20 22:41</w:t>
+      <w:t>Datos sintéticos · demo · 2026-10-20 23:00</w:t>
     </w:r>
   </w:p>
 </w:ftr>

</xml_diff>

<commit_message>
chore: checkpoint previo a W0 (estado Streamlit + OpenRouter)
Co-Authored-By: Claude Sonnet 5.5 <noreply@anthropic.com>
</commit_message>
<xml_diff>
--- a/runs/demo/propuesta_cliente.docx
+++ b/runs/demo/propuesta_cliente.docx
@@ -18,7 +18,7 @@
         <w:rPr>
           <w:i/>
         </w:rPr>
-        <w:t>Modo: Cliente · Run ID: demo · Fecha: 2026-10-20 23:00</w:t>
+        <w:t>Modo: Cliente · Run ID: demo · Fecha: 2026-10-21 15:56</w:t>
         <w:br/>
         <w:t>Sello Revisor: 578/578 cifras trazables · 0 incidencias normativas</w:t>
         <w:br/>
@@ -9165,7 +9165,7 @@
         <w:color w:val="646464"/>
         <w:sz w:val="17"/>
       </w:rPr>
-      <w:t>Datos sintéticos · demo · 2026-10-20 23:00</w:t>
+      <w:t>Datos sintéticos · demo · 2026-10-21 15:56</w:t>
     </w:r>
   </w:p>
 </w:ftr>

</xml_diff>